<commit_message>
fix(enrollment): retain clearance on reopening
Preserve clearance approval for unchanged terms. Invalidate it when
school year or semester changes, retaining file evidence.

Update confirmation text, regression tests, and system guide.
</commit_message>
<xml_diff>
--- a/docs/Enrollment-System-Complete-Guide.docx
+++ b/docs/Enrollment-System-Complete-Guide.docx
@@ -53,7 +53,7 @@
       </w:pPr>
       <w:r>
         <w:rPr/>
-        <w:t xml:space="preserve">Repository baseline: 5b39c02. Describes the checked-out source at preparation time, including uncommitted source if present.</w:t>
+        <w:t xml:space="preserve">Repository baseline: ee5eb42 plus local reopening/clearance updates. Describes the checked-out source at preparation time, including uncommitted source if present.</w:t>
       </w:r>
     </w:p>
     <w:p>
@@ -1176,11 +1176,11 @@
           <w:sz w:val="18"/>
           <w:color w:val="285B52"/>
         </w:rPr>
-        <w:t xml:space="preserve">5b39c02</w:t>
-      </w:r>
-      <w:r>
-        <w:rPr/>
-        <w:t xml:space="preserve">. It includes changes since the original </w:t>
+        <w:t xml:space="preserve">ee5eb42</w:t>
+      </w:r>
+      <w:r>
+        <w:rPr/>
+        <w:t xml:space="preserve"> plus the current uncommitted reopening/clearance changes. It includes changes since the original </w:t>
       </w:r>
       <w:r>
         <w:rPr>
@@ -1192,7 +1192,7 @@
       </w:r>
       <w:r>
         <w:rPr/>
-        <w:t xml:space="preserve"> edition: current-only student enrollment pages, staff-only curriculum access, Gemini handwriting and manual identity review, required academic documents, and subject prerequisites. It does not inspect a live institution's operational database or assume every service is configured. Current code takes precedence over older notes.</w:t>
+        <w:t xml:space="preserve"> edition: current-only student enrollment pages, staff-only curriculum access, Gemini handwriting and manual identity review, required academic documents, and subject prerequisites. Reopening now preserves clearance, while school-year/semester corrections invalidate it. This guide does not inspect a live institution's operational database or assume every service is configured. Current code takes precedence over older notes.</w:t>
       </w:r>
     </w:p>
     <w:p>
@@ -4745,7 +4745,7 @@
       </w:pPr>
       <w:r>
         <w:rPr/>
-        <w:t xml:space="preserve">When a curriculum changes, create a new draft and activate it. Published curricula are not edited in place. When a finalized grade is wrong, reopen the enrollment with a reason, correct and finalize the grades again, then complete any reset clearance requirements. When a staff account should be suspended temporarily, disable it rather than permanently delete it.</w:t>
+        <w:t xml:space="preserve">When a curriculum changes, create a new draft and activate it. Published curricula are not edited in place. When a finalized grade is wrong, reopen the enrollment with a reason, correct and finalize the grades again. Existing clearance and its verification remain valid for the same term. When a staff account should be suspended temporarily, disable it rather than permanently delete it.</w:t>
       </w:r>
     </w:p>
     <w:p>
@@ -7391,7 +7391,7 @@
       </w:r>
       <w:r>
         <w:rPr/>
-        <w:t xml:space="preserve">, increments revision, and records the release notification. Status is completed if clearance was already verified; otherwise it remains enrolled. The current clearance workflow normally verifies only after finalization.</w:t>
+        <w:t xml:space="preserve">, increments revision, and records the release notification. Status is completed if clearance was already verified; otherwise it remains enrolled. This also applies after reopening: retained same-term approval makes refinalization complete the enrollment without another clearance upload or verification. The current clearance workflow normally verifies only after finalization.</w:t>
       </w:r>
     </w:p>
     <w:p>
@@ -9667,7 +9667,7 @@
             </w:pPr>
             <w:r>
               <w:rPr/>
-              <w:t xml:space="preserve">Drop/reopen invalidated prior evidence; restore eligibility before uploading again.</w:t>
+              <w:t xml:space="preserve">Dropping or changing the enrollment term invalidated prior evidence; restore eligibility before uploading again.</w:t>
             </w:r>
           </w:p>
         </w:tc>
@@ -9684,7 +9684,7 @@
       </w:pPr>
       <w:r>
         <w:rPr/>
-        <w:t xml:space="preserve">Correction resets the enrollment clearance flag but does not itself rewrite submission state. Drop/reopen explicitly invalidates. Changing the global template blocks requesting old ready evidence; already-requested verification uses saved evidence.</w:t>
+        <w:t xml:space="preserve">Reopening and same-term corrections preserve the existing clearance file, submission state and verification. Changing the semester or school year clears the enrollment clearance flag and invalidates the saved submission while retaining its file. Dropping also invalidates clearance. Changing the global template blocks requesting old ready evidence; already-requested verification uses saved evidence.</w:t>
       </w:r>
     </w:p>
     <w:p>
@@ -9697,7 +9697,7 @@
         <w:drawing>
           <wp:inline distT="0" distB="0" distL="0" distR="0">
             <wp:extent cx="6254496" cy="5903366"/>
-            <wp:docPr id="20" name="Flowchart 20" descr="Flowchart 20. Submission lifecycle is unchanged; ready can carry an identity-review warning and verified records retain the original machine findings."/>
+            <wp:docPr id="20" name="Flowchart 20" descr="Flowchart 20. Reopening and same-term corrections retain clearance state/approval. A term correction or drop invalidates evidence while retaining its file; ready can still carry an identity-review warning."/>
             <wp:cNvGraphicFramePr>
               <a:graphicFrameLocks noChangeAspect="1"/>
             </wp:cNvGraphicFramePr>
@@ -9736,7 +9736,7 @@
       </w:pPr>
       <w:r>
         <w:rPr/>
-        <w:t xml:space="preserve">Flowchart 20. Submission lifecycle is unchanged; ready can carry an identity-review warning and verified records retain the original machine findings.</w:t>
+        <w:t xml:space="preserve">Flowchart 20. Reopening and same-term corrections retain clearance state/approval. A term correction or drop invalidates evidence while retaining its file; ready can still carry an identity-review warning.</w:t>
       </w:r>
       <w:r>
         <w:rPr>
@@ -10702,7 +10702,7 @@
       </w:pPr>
       <w:r>
         <w:rPr/>
-        <w:t xml:space="preserve">Correction also revalidates current global prerequisite rules using the corrected term and excluding this enrollment. Required-document final-term gating is explicitly exempt in the correction editor and server path; it must not be described as enforced for corrections. Saving resets the enrollment clearance flag and meeting/follow-up timestamps, increments revision, and writes the audit plus notification in the same transaction. It does not itself update the clearance-submission row's status. Email is attempted afterward.</w:t>
+        <w:t xml:space="preserve">Correction also revalidates current global prerequisite rules using the corrected term and excluding this enrollment. Required-document final-term gating is explicitly exempt in the correction editor and server path; it must not be described as enforced for corrections. Saving resets meeting/follow-up timestamps, increments revision, and writes the audit plus notification in the same transaction. Same-term corrections preserve clearance and its approval. Changing school year or semester clears approval and invalidates the submission without deleting its file. Email is attempted afterward.</w:t>
       </w:r>
     </w:p>
     <w:p>
@@ -10765,17 +10765,330 @@
       </w:pPr>
       <w:r>
         <w:rPr/>
-        <w:t xml:space="preserve">Reopening retains saved grades but makes them provisional again. It sets finalization false, status enrolled, clearance false, clears meeting/follow-up timestamps, invalidates uploaded clearance, and increments revision. Student-facing loaders mask those grades until refinalization.</w:t>
-      </w:r>
-    </w:p>
-    <w:p>
-      <w:pPr>
-        <w:pStyle w:val="Normal"/>
-      </w:pPr>
-      <w:r>
-        <w:rPr/>
-        <w:t xml:space="preserve">Staff must review and finalize again. Current clearance must then be resubmitted/reverified through the applicable workflow. A reopened historical record is not automatically the student's current enrollment; current-only clearance rules continue to apply.</w:t>
-      </w:r>
+        <w:t xml:space="preserve">Reopening retains saved grades but makes them provisional again. It sets finalization false, status enrolled, clears meeting/follow-up timestamps, and increments revision. Existing clearance files, findings, submission state and verification are preserved. Student-facing loaders mask those grades until refinalization.</w:t>
+      </w:r>
+    </w:p>
+    <w:p>
+      <w:pPr>
+        <w:pStyle w:val="Normal"/>
+      </w:pPr>
+      <w:r>
+        <w:rPr/>
+        <w:t xml:space="preserve">Staff must review and finalize grades again. An already verified clearance for that term does not require another upload or verification. Unverified, rejected or invalidated evidence retains its existing status; reopening does not approve it. A reopened historical record is not automatically the student's current enrollment; current-only clearance rules continue to apply.</w:t>
+      </w:r>
+    </w:p>
+    <w:p>
+      <w:pPr>
+        <w:pStyle w:val="Normal"/>
+      </w:pPr>
+      <w:r>
+        <w:rPr/>
+        <w:t xml:space="preserve">Preserved clearance does not remove the grade-finalization gate. While reopened grades are draft, students see Pending and ordinary next enrollment remains blocked. Refinalizing sets the record back to completed when its retained clearance flag is true; otherwise it stays enrolled awaiting the existing clearance workflow. Failed-grade follow-up was reset, so a required meeting must be requested/completed again if the released grades still contain failures.</w:t>
+      </w:r>
+    </w:p>
+    <w:p>
+      <w:pPr>
+        <w:pStyle w:val="Normal"/>
+      </w:pPr>
+      <w:r>
+        <w:rPr/>
+        <w:t xml:space="preserve">The correction's term-change check compares only school-year start and semester. Program, year level, section, subject-list, or unit changes alone do not invalidate clearance when those two term values remain unchanged. Staff still follows every other correction, prerequisite, and chronology restriction.</w:t>
+      </w:r>
+    </w:p>
+    <w:tbl>
+      <w:tblPr>
+        <w:tblW w:w="9840" w:type="dxa"/>
+        <w:tblLayout w:type="fixed"/>
+        <w:tblBorders>
+          <w:top w:val="single" w:sz="4" w:color="D7E1DE"/>
+          <w:left w:val="single" w:sz="4" w:color="D7E1DE"/>
+          <w:bottom w:val="single" w:sz="4" w:color="D7E1DE"/>
+          <w:right w:val="single" w:sz="4" w:color="D7E1DE"/>
+          <w:insideH w:val="single" w:sz="4" w:color="D7E1DE"/>
+          <w:insideV w:val="single" w:sz="4" w:color="D7E1DE"/>
+        </w:tblBorders>
+        <w:tblCellMar>
+          <w:top w:w="90" w:type="dxa"/>
+          <w:left w:w="105" w:type="dxa"/>
+          <w:bottom w:w="90" w:type="dxa"/>
+          <w:right w:w="105" w:type="dxa"/>
+        </w:tblCellMar>
+      </w:tblPr>
+      <w:tblGrid>
+        <w:gridCol w:w="2850"/>
+        <w:gridCol w:w="6990"/>
+      </w:tblGrid>
+      <w:tr>
+        <w:trPr>
+          <w:cantSplit/>
+          <w:tblHeader/>
+        </w:trPr>
+        <w:tc>
+          <w:tcPr>
+            <w:tcW w:w="2850" w:type="dxa"/>
+            <w:shd w:fill="164A42"/>
+            <w:vAlign w:val="center"/>
+          </w:tcPr>
+          <w:p>
+            <w:pPr>
+              <w:pStyle w:val="TableText"/>
+            </w:pPr>
+            <w:r>
+              <w:rPr>
+                <w:color w:val="FFFFFF"/>
+                <w:b/>
+              </w:rPr>
+              <w:t xml:space="preserve">Action or starting state</w:t>
+            </w:r>
+          </w:p>
+        </w:tc>
+        <w:tc>
+          <w:tcPr>
+            <w:tcW w:w="6990" w:type="dxa"/>
+            <w:shd w:fill="164A42"/>
+            <w:vAlign w:val="center"/>
+          </w:tcPr>
+          <w:p>
+            <w:pPr>
+              <w:pStyle w:val="TableText"/>
+            </w:pPr>
+            <w:r>
+              <w:rPr>
+                <w:color w:val="FFFFFF"/>
+                <w:b/>
+              </w:rPr>
+              <w:t xml:space="preserve">Clearance effect and next step</w:t>
+            </w:r>
+          </w:p>
+        </w:tc>
+      </w:tr>
+      <w:tr>
+        <w:trPr>
+          <w:cantSplit/>
+        </w:trPr>
+        <w:tc>
+          <w:tcPr>
+            <w:tcW w:w="2850" w:type="dxa"/>
+            <w:shd w:fill="F1F6F4"/>
+            <w:vAlign w:val="center"/>
+          </w:tcPr>
+          <w:p>
+            <w:pPr>
+              <w:pStyle w:val="TableText"/>
+            </w:pPr>
+            <w:r>
+              <w:rPr/>
+              <w:t xml:space="preserve">Reopen with verified clearance</w:t>
+            </w:r>
+          </w:p>
+        </w:tc>
+        <w:tc>
+          <w:tcPr>
+            <w:tcW w:w="6990" w:type="dxa"/>
+            <w:shd w:fill="F1F6F4"/>
+            <w:vAlign w:val="center"/>
+          </w:tcPr>
+          <w:p>
+            <w:pPr>
+              <w:pStyle w:val="TableText"/>
+            </w:pPr>
+            <w:r>
+              <w:rPr/>
+              <w:t xml:space="preserve">Preserve file, findings, submission state, request/reviewer metadata, and approval. Re-finalize grades; no duplicate clearance approval for the unchanged term.</w:t>
+            </w:r>
+          </w:p>
+        </w:tc>
+      </w:tr>
+      <w:tr>
+        <w:trPr>
+          <w:cantSplit/>
+        </w:trPr>
+        <w:tc>
+          <w:tcPr>
+            <w:tcW w:w="2850" w:type="dxa"/>
+            <w:shd w:fill="FFFFFF"/>
+            <w:vAlign w:val="center"/>
+          </w:tcPr>
+          <w:p>
+            <w:pPr>
+              <w:pStyle w:val="TableText"/>
+            </w:pPr>
+            <w:r>
+              <w:rPr/>
+              <w:t xml:space="preserve">Reopen with ready/requested/rejected/invalidated evidence</w:t>
+            </w:r>
+          </w:p>
+        </w:tc>
+        <w:tc>
+          <w:tcPr>
+            <w:tcW w:w="6990" w:type="dxa"/>
+            <w:shd w:fill="FFFFFF"/>
+            <w:vAlign w:val="center"/>
+          </w:tcPr>
+          <w:p>
+            <w:pPr>
+              <w:pStyle w:val="TableText"/>
+            </w:pPr>
+            <w:r>
+              <w:rPr/>
+              <w:t xml:space="preserve">Preserve its current state without granting approval. Clearance upload/request/review operations still require finalized grades and their normal eligibility.</w:t>
+            </w:r>
+          </w:p>
+        </w:tc>
+      </w:tr>
+      <w:tr>
+        <w:trPr>
+          <w:cantSplit/>
+        </w:trPr>
+        <w:tc>
+          <w:tcPr>
+            <w:tcW w:w="2850" w:type="dxa"/>
+            <w:shd w:fill="F1F6F4"/>
+            <w:vAlign w:val="center"/>
+          </w:tcPr>
+          <w:p>
+            <w:pPr>
+              <w:pStyle w:val="TableText"/>
+            </w:pPr>
+            <w:r>
+              <w:rPr/>
+              <w:t xml:space="preserve">Reopen with no submission</w:t>
+            </w:r>
+          </w:p>
+        </w:tc>
+        <w:tc>
+          <w:tcPr>
+            <w:tcW w:w="6990" w:type="dxa"/>
+            <w:shd w:fill="F1F6F4"/>
+            <w:vAlign w:val="center"/>
+          </w:tcPr>
+          <w:p>
+            <w:pPr>
+              <w:pStyle w:val="TableText"/>
+            </w:pPr>
+            <w:r>
+              <w:rPr/>
+              <w:t xml:space="preserve">Do not create a clearance record or grant approval.</w:t>
+            </w:r>
+          </w:p>
+        </w:tc>
+      </w:tr>
+      <w:tr>
+        <w:trPr>
+          <w:cantSplit/>
+        </w:trPr>
+        <w:tc>
+          <w:tcPr>
+            <w:tcW w:w="2850" w:type="dxa"/>
+            <w:shd w:fill="FFFFFF"/>
+            <w:vAlign w:val="center"/>
+          </w:tcPr>
+          <w:p>
+            <w:pPr>
+              <w:pStyle w:val="TableText"/>
+            </w:pPr>
+            <w:r>
+              <w:rPr/>
+              <w:t xml:space="preserve">Correct without changing school-year start or semester</w:t>
+            </w:r>
+          </w:p>
+        </w:tc>
+        <w:tc>
+          <w:tcPr>
+            <w:tcW w:w="6990" w:type="dxa"/>
+            <w:shd w:fill="FFFFFF"/>
+            <w:vAlign w:val="center"/>
+          </w:tcPr>
+          <w:p>
+            <w:pPr>
+              <w:pStyle w:val="TableText"/>
+            </w:pPr>
+            <w:r>
+              <w:rPr/>
+              <w:t xml:space="preserve">Preserve existing submission and clearance flag, including when program/class/subjects change. Meeting/follow-up timestamps still reset.</w:t>
+            </w:r>
+          </w:p>
+        </w:tc>
+      </w:tr>
+      <w:tr>
+        <w:trPr>
+          <w:cantSplit/>
+        </w:trPr>
+        <w:tc>
+          <w:tcPr>
+            <w:tcW w:w="2850" w:type="dxa"/>
+            <w:shd w:fill="F1F6F4"/>
+            <w:vAlign w:val="center"/>
+          </w:tcPr>
+          <w:p>
+            <w:pPr>
+              <w:pStyle w:val="TableText"/>
+            </w:pPr>
+            <w:r>
+              <w:rPr/>
+              <w:t xml:space="preserve">Correct school-year start or semester</w:t>
+            </w:r>
+          </w:p>
+        </w:tc>
+        <w:tc>
+          <w:tcPr>
+            <w:tcW w:w="6990" w:type="dxa"/>
+            <w:shd w:fill="F1F6F4"/>
+            <w:vAlign w:val="center"/>
+          </w:tcPr>
+          <w:p>
+            <w:pPr>
+              <w:pStyle w:val="TableText"/>
+            </w:pPr>
+            <w:r>
+              <w:rPr/>
+              <w:t xml:space="preserve">Set clearance flag false and saved submission invalidated; retain original file/findings/reviewer metadata as evidence. After grade finalization, obtain new eligible clearance for the corrected term.</w:t>
+            </w:r>
+          </w:p>
+        </w:tc>
+      </w:tr>
+      <w:tr>
+        <w:trPr>
+          <w:cantSplit/>
+        </w:trPr>
+        <w:tc>
+          <w:tcPr>
+            <w:tcW w:w="2850" w:type="dxa"/>
+            <w:shd w:fill="FFFFFF"/>
+            <w:vAlign w:val="center"/>
+          </w:tcPr>
+          <w:p>
+            <w:pPr>
+              <w:pStyle w:val="TableText"/>
+            </w:pPr>
+            <w:r>
+              <w:rPr/>
+              <w:t xml:space="preserve">Refinalize after reopening</w:t>
+            </w:r>
+          </w:p>
+        </w:tc>
+        <w:tc>
+          <w:tcPr>
+            <w:tcW w:w="6990" w:type="dxa"/>
+            <w:shd w:fill="FFFFFF"/>
+            <w:vAlign w:val="center"/>
+          </w:tcPr>
+          <w:p>
+            <w:pPr>
+              <w:pStyle w:val="TableText"/>
+            </w:pPr>
+            <w:r>
+              <w:rPr/>
+              <w:t xml:space="preserve">Completed if retained clearance flag is true; enrolled otherwise. Next enrollment must still satisfy meetings, documents, prerequisites, and other save checks.</w:t>
+            </w:r>
+          </w:p>
+        </w:tc>
+      </w:tr>
+    </w:tbl>
+    <w:p>
+      <w:pPr>
+        <w:pStyle w:val="Spacer"/>
+      </w:pPr>
     </w:p>
     <w:p>
       <w:pPr>
@@ -14757,7 +15070,7 @@
       </w:pPr>
       <w:r>
         <w:rPr/>
-        <w:t xml:space="preserve">If grades are already finalized, an administrator must reopen before academic correction. Reopening invalidates clearance/follow-up and masks grades until rerelease.</w:t>
+        <w:t xml:space="preserve">If grades are already finalized, an administrator must reopen before academic correction. Reopening resets follow-up and masks grades until rerelease, while preserving existing clearance and its verification for the same term.</w:t>
       </w:r>
     </w:p>
     <w:p>
@@ -16573,7 +16886,7 @@
       </w:pPr>
       <w:r>
         <w:rPr/>
-        <w:t xml:space="preserve">Saving is a staff draft; students receive Pending rather than provisional values. Finalization compares the reviewed complete saved grade set, releases it, locks it, and creates a notification. Blank saved grades become INC. A later correction needs permitted administrator reopening rather than silent alteration of released results.</w:t>
+        <w:t xml:space="preserve">Saving is a staff draft; students receive Pending rather than provisional values. Finalization compares the reviewed complete saved grade set, releases it, locks it, and creates a notification. Blank saved grades become INC. A later correction needs permitted administrator reopening rather than silent alteration of released results. Reopening preserves same-term clearance, so refinalizing can restore completed status without making the student repeat a valid approval.</w:t>
       </w:r>
     </w:p>
     <w:p>
@@ -16645,7 +16958,7 @@
       </w:pPr>
       <w:r>
         <w:rPr/>
-        <w:t xml:space="preserve">Correct fixes allowed draft enrollment details; void preserves an incorrect attempt as invalid; reopen lets an administrator make finalized grades provisional again; drop records actual withdrawal. Their permissions, audit effects, and current-pointer behavior differ. Conflating them would lose the meaning of historical academic events.</w:t>
+        <w:t xml:space="preserve">Correct fixes allowed draft enrollment details; void preserves an incorrect attempt as invalid; reopen lets an administrator make finalized grades provisional again; drop records actual withdrawal. Reopening and same-term corrections preserve clearance; changing school year/semester invalidates its approval while retaining the file. Reopening resets academic follow-up and still requires grade refinalization. Their permissions, audit effects, and current-pointer behavior differ.</w:t>
       </w:r>
     </w:p>
     <w:p>

</xml_diff>